<commit_message>
inclur o paragrafo também sou do vovô
</commit_message>
<xml_diff>
--- a/git em ação/Eu sou da vovó.docx
+++ b/git em ação/Eu sou da vovó.docx
@@ -5,6 +5,14 @@
     <w:p>
       <w:r>
         <w:t>Eu sou da vovó</w:t>
+      </w:r>
+    </w:p>
+    <w:p>
+      <w:r>
+        <w:t>Também sou do vov</w:t>
+      </w:r>
+      <w:r>
+        <w:t>ô</w:t>
       </w:r>
       <w:bookmarkStart w:id="0" w:name="_GoBack"/>
       <w:bookmarkEnd w:id="0"/>

</xml_diff>